<commit_message>
move odcode because that is work in the idea
</commit_message>
<xml_diff>
--- a/repository/郑光宇13692646967再改版.docx
+++ b/repository/郑光宇13692646967再改版.docx
@@ -169,7 +169,7 @@
               <w:ind w:right="219"/>
               <w:jc w:val="right"/>
               <w:rPr>
-                <w:rFonts w:ascii="黑体" w:eastAsia="黑体" w:hAnsi="黑体" w:cs="Tahoma"/>
+                <w:rFonts w:ascii="SimHei" w:eastAsia="SimHei" w:hAnsi="SimHei" w:cs="Tahoma"/>
                 <w:color w:val="444444"/>
                 <w:sz w:val="22"/>
                 <w:szCs w:val="22"/>
@@ -177,7 +177,7 @@
             </w:pPr>
             <w:r>
               <w:rPr>
-                <w:rFonts w:ascii="黑体" w:eastAsia="黑体" w:hAnsi="黑体" w:cs="Tahoma" w:hint="eastAsia"/>
+                <w:rFonts w:ascii="SimHei" w:eastAsia="SimHei" w:hAnsi="SimHei" w:cs="Tahoma" w:hint="eastAsia"/>
                 <w:b/>
                 <w:bCs/>
                 <w:color w:val="444444"/>
@@ -188,7 +188,7 @@
             </w:r>
             <w:r>
               <w:rPr>
-                <w:rFonts w:ascii="黑体" w:eastAsia="黑体" w:hAnsi="黑体" w:cs="Tahoma" w:hint="eastAsia"/>
+                <w:rFonts w:ascii="SimHei" w:eastAsia="SimHei" w:hAnsi="SimHei" w:cs="Tahoma" w:hint="eastAsia"/>
                 <w:b/>
                 <w:bCs/>
                 <w:color w:val="444444"/>
@@ -199,7 +199,7 @@
             </w:r>
             <w:r>
               <w:rPr>
-                <w:rFonts w:ascii="黑体" w:eastAsia="黑体" w:hAnsi="黑体" w:cs="Tahoma" w:hint="eastAsia"/>
+                <w:rFonts w:ascii="SimHei" w:eastAsia="SimHei" w:hAnsi="SimHei" w:cs="Tahoma" w:hint="eastAsia"/>
                 <w:b/>
                 <w:bCs/>
                 <w:color w:val="444444"/>
@@ -302,14 +302,14 @@
               <w:spacing w:line="505" w:lineRule="atLeast"/>
               <w:jc w:val="right"/>
               <w:rPr>
-                <w:rFonts w:ascii="华文细黑" w:eastAsia="华文细黑" w:hAnsi="Times New Roman" w:cs="华文细黑"/>
+                <w:rFonts w:ascii="STXihei" w:eastAsia="STXihei" w:hAnsi="Times New Roman" w:cs="STXihei"/>
                 <w:sz w:val="44"/>
                 <w:szCs w:val="44"/>
               </w:rPr>
             </w:pPr>
             <w:r>
               <w:rPr>
-                <w:rFonts w:ascii="华文细黑" w:eastAsia="华文细黑" w:hAnsi="Times New Roman" w:cs="华文细黑" w:hint="eastAsia"/>
+                <w:rFonts w:ascii="STXihei" w:eastAsia="STXihei" w:hAnsi="Times New Roman" w:cs="STXihei" w:hint="eastAsia"/>
                 <w:b/>
                 <w:bCs/>
                 <w:sz w:val="44"/>
@@ -640,7 +640,7 @@
             <w:hyperlink r:id="rId9" w:history="1">
               <w:r>
                 <w:rPr>
-                  <w:rStyle w:val="a7"/>
+                  <w:rStyle w:val="Hyperlink"/>
                   <w:rFonts w:cs="Arial"/>
                   <w:u w:val="none"/>
                 </w:rPr>
@@ -648,7 +648,7 @@
               </w:r>
               <w:r>
                 <w:rPr>
-                  <w:rStyle w:val="a7"/>
+                  <w:rStyle w:val="Hyperlink"/>
                   <w:rFonts w:ascii="Tahoma" w:hAnsi="Tahoma" w:cs="Tahoma"/>
                   <w:sz w:val="21"/>
                   <w:szCs w:val="21"/>
@@ -712,7 +712,7 @@
             <w:pPr>
               <w:spacing w:line="360" w:lineRule="atLeast"/>
               <w:rPr>
-                <w:rFonts w:ascii="华文细黑" w:eastAsia="华文细黑" w:hAnsi="Times New Roman" w:cs="华文细黑"/>
+                <w:rFonts w:ascii="STXihei" w:eastAsia="STXihei" w:hAnsi="Times New Roman" w:cs="STXihei"/>
                 <w:color w:val="A64D79"/>
                 <w:sz w:val="36"/>
                 <w:szCs w:val="36"/>
@@ -720,7 +720,7 @@
             </w:pPr>
             <w:r>
               <w:rPr>
-                <w:rFonts w:ascii="华文细黑" w:eastAsia="华文细黑" w:hAnsi="Times New Roman" w:cs="华文细黑" w:hint="eastAsia"/>
+                <w:rFonts w:ascii="STXihei" w:eastAsia="STXihei" w:hAnsi="Times New Roman" w:cs="STXihei" w:hint="eastAsia"/>
                 <w:b/>
                 <w:bCs/>
                 <w:color w:val="A64D79"/>
@@ -816,7 +816,7 @@
             <w:pPr>
               <w:spacing w:line="360" w:lineRule="atLeast"/>
               <w:rPr>
-                <w:rFonts w:ascii="华文细黑" w:eastAsia="华文细黑" w:hAnsi="Times New Roman" w:cs="华文细黑"/>
+                <w:rFonts w:ascii="STXihei" w:eastAsia="STXihei" w:hAnsi="Times New Roman" w:cs="STXihei"/>
                 <w:color w:val="674EA7"/>
                 <w:sz w:val="36"/>
                 <w:szCs w:val="36"/>
@@ -1043,14 +1043,14 @@
               <w:spacing w:line="315" w:lineRule="atLeast"/>
               <w:jc w:val="right"/>
               <w:rPr>
-                <w:rFonts w:ascii="宋体" w:eastAsia="宋体" w:hAnsi="Times New Roman" w:cs="宋体"/>
-                <w:sz w:val="21"/>
-                <w:szCs w:val="21"/>
-              </w:rPr>
-            </w:pPr>
-            <w:r>
-              <w:rPr>
-                <w:rFonts w:ascii="宋体" w:eastAsia="宋体" w:hAnsi="Times New Roman" w:cs="宋体" w:hint="eastAsia"/>
+                <w:rFonts w:ascii="SimSun" w:eastAsia="SimSun" w:hAnsi="Times New Roman" w:cs="SimSun"/>
+                <w:sz w:val="21"/>
+                <w:szCs w:val="21"/>
+              </w:rPr>
+            </w:pPr>
+            <w:r>
+              <w:rPr>
+                <w:rFonts w:ascii="SimSun" w:eastAsia="SimSun" w:hAnsi="Times New Roman" w:cs="SimSun" w:hint="eastAsia"/>
                 <w:sz w:val="21"/>
                 <w:szCs w:val="21"/>
               </w:rPr>
@@ -1201,7 +1201,7 @@
       <w:pPr>
         <w:ind w:firstLineChars="300" w:firstLine="660"/>
         <w:rPr>
-          <w:rFonts w:ascii="宋体" w:eastAsia="宋体" w:hAnsi="Times New Roman" w:cs="宋体"/>
+          <w:rFonts w:ascii="SimSun" w:eastAsia="SimSun" w:hAnsi="Times New Roman" w:cs="SimSun"/>
           <w:vanish/>
           <w:sz w:val="21"/>
           <w:szCs w:val="21"/>
@@ -1220,7 +1220,7 @@
       </w:r>
       <w:r>
         <w:rPr>
-          <w:rFonts w:ascii="宋体" w:eastAsia="宋体" w:hAnsi="Times New Roman" w:cs="宋体" w:hint="eastAsia"/>
+          <w:rFonts w:ascii="SimSun" w:eastAsia="SimSun" w:hAnsi="Times New Roman" w:cs="SimSun" w:hint="eastAsia"/>
           <w:vanish/>
           <w:sz w:val="21"/>
           <w:szCs w:val="21"/>
@@ -1229,7 +1229,7 @@
       </w:r>
       <w:r>
         <w:rPr>
-          <w:rFonts w:ascii="宋体" w:eastAsia="宋体" w:hAnsi="Times New Roman" w:cs="宋体" w:hint="eastAsia"/>
+          <w:rFonts w:ascii="SimSun" w:eastAsia="SimSun" w:hAnsi="Times New Roman" w:cs="SimSun" w:hint="eastAsia"/>
           <w:vanish/>
           <w:sz w:val="21"/>
           <w:szCs w:val="21"/>
@@ -1238,7 +1238,7 @@
       </w:r>
       <w:r>
         <w:rPr>
-          <w:rFonts w:ascii="宋体" w:eastAsia="宋体" w:hAnsi="Times New Roman" w:cs="宋体" w:hint="eastAsia"/>
+          <w:rFonts w:ascii="SimSun" w:eastAsia="SimSun" w:hAnsi="Times New Roman" w:cs="SimSun" w:hint="eastAsia"/>
           <w:vanish/>
           <w:sz w:val="21"/>
           <w:szCs w:val="21"/>
@@ -1250,7 +1250,7 @@
       <w:pPr>
         <w:ind w:left="720"/>
         <w:rPr>
-          <w:rFonts w:ascii="宋体" w:eastAsia="宋体" w:hAnsi="Times New Roman" w:cs="宋体"/>
+          <w:rFonts w:ascii="SimSun" w:eastAsia="SimSun" w:hAnsi="Times New Roman" w:cs="SimSun"/>
           <w:vanish/>
           <w:sz w:val="21"/>
           <w:szCs w:val="21"/>
@@ -1261,7 +1261,7 @@
       <w:pPr>
         <w:ind w:left="720"/>
         <w:rPr>
-          <w:rFonts w:ascii="宋体" w:eastAsia="宋体" w:hAnsi="Times New Roman" w:cs="宋体"/>
+          <w:rFonts w:ascii="SimSun" w:eastAsia="SimSun" w:hAnsi="Times New Roman" w:cs="SimSun"/>
           <w:vanish/>
           <w:sz w:val="21"/>
           <w:szCs w:val="21"/>
@@ -1532,25 +1532,7 @@
                 <w:sz w:val="21"/>
                 <w:szCs w:val="21"/>
               </w:rPr>
-              <w:t>广东工业大学大学生数学</w:t>
-            </w:r>
-            <w:proofErr w:type="gramStart"/>
-            <w:r>
-              <w:rPr>
-                <w:rFonts w:ascii="Tahoma" w:hAnsi="Tahoma" w:cs="Tahoma" w:hint="eastAsia"/>
-                <w:sz w:val="21"/>
-                <w:szCs w:val="21"/>
-              </w:rPr>
-              <w:t>竞赛非</w:t>
-            </w:r>
-            <w:proofErr w:type="gramEnd"/>
-            <w:r>
-              <w:rPr>
-                <w:rFonts w:ascii="Tahoma" w:hAnsi="Tahoma" w:cs="Tahoma" w:hint="eastAsia"/>
-                <w:sz w:val="21"/>
-                <w:szCs w:val="21"/>
-              </w:rPr>
-              <w:t>数学类二等奖</w:t>
+              <w:t>广东工业大学大学生数学竞赛非数学类二等奖</w:t>
             </w:r>
           </w:p>
         </w:tc>
@@ -1889,18 +1871,8 @@
                 <w:sz w:val="21"/>
                 <w:szCs w:val="21"/>
               </w:rPr>
-              <w:t>担任过团委青</w:t>
-            </w:r>
-            <w:proofErr w:type="gramStart"/>
-            <w:r>
-              <w:rPr>
-                <w:rFonts w:ascii="Tahoma" w:hAnsi="Tahoma" w:cs="Tahoma" w:hint="eastAsia"/>
-                <w:sz w:val="21"/>
-                <w:szCs w:val="21"/>
-              </w:rPr>
-              <w:t>志部长</w:t>
-            </w:r>
-            <w:proofErr w:type="gramEnd"/>
+              <w:t>担任过团委青志部长</w:t>
+            </w:r>
             <w:r>
               <w:rPr>
                 <w:rFonts w:ascii="Tahoma" w:hAnsi="Tahoma" w:cs="Tahoma" w:hint="eastAsia"/>
@@ -2006,7 +1978,7 @@
     </w:p>
     <w:tbl>
       <w:tblPr>
-        <w:tblStyle w:val="a9"/>
+        <w:tblStyle w:val="TableGrid"/>
         <w:tblW w:w="9627" w:type="dxa"/>
         <w:tblBorders>
           <w:top w:val="none" w:sz="0" w:space="0" w:color="auto"/>
@@ -2062,7 +2034,7 @@
                   <w:pPr>
                     <w:spacing w:line="360" w:lineRule="atLeast"/>
                     <w:rPr>
-                      <w:rFonts w:ascii="华文细黑" w:eastAsia="华文细黑" w:hAnsi="Times New Roman" w:cs="华文细黑"/>
+                      <w:rFonts w:ascii="STXihei" w:eastAsia="STXihei" w:hAnsi="Times New Roman" w:cs="STXihei"/>
                       <w:color w:val="A64D79"/>
                       <w:sz w:val="36"/>
                       <w:szCs w:val="36"/>
@@ -2070,7 +2042,7 @@
                   </w:pPr>
                   <w:r>
                     <w:rPr>
-                      <w:rFonts w:ascii="华文细黑" w:eastAsia="华文细黑" w:hAnsi="Times New Roman" w:cs="华文细黑" w:hint="eastAsia"/>
+                      <w:rFonts w:ascii="STXihei" w:eastAsia="STXihei" w:hAnsi="Times New Roman" w:cs="STXihei" w:hint="eastAsia"/>
                       <w:b/>
                       <w:bCs/>
                       <w:color w:val="A64D79"/>
@@ -3051,6 +3023,7 @@
                     </w:rPr>
                     <w:t>等工具在</w:t>
                   </w:r>
+                  <w:proofErr w:type="spellStart"/>
                   <w:r>
                     <w:rPr>
                       <w:rFonts w:ascii="Times New Roman" w:hAnsi="Times New Roman" w:cs="Times New Roman" w:hint="eastAsia"/>
@@ -3059,31 +3032,14 @@
                     </w:rPr>
                     <w:t>linux</w:t>
                   </w:r>
+                  <w:proofErr w:type="spellEnd"/>
                   <w:r>
                     <w:rPr>
                       <w:rFonts w:ascii="Times New Roman" w:hAnsi="Times New Roman" w:cs="Times New Roman" w:hint="eastAsia"/>
                       <w:sz w:val="21"/>
                       <w:szCs w:val="21"/>
                     </w:rPr>
-                    <w:t>环境</w:t>
-                  </w:r>
-                  <w:proofErr w:type="gramStart"/>
-                  <w:r>
-                    <w:rPr>
-                      <w:rFonts w:ascii="Times New Roman" w:hAnsi="Times New Roman" w:cs="Times New Roman" w:hint="eastAsia"/>
-                      <w:sz w:val="21"/>
-                      <w:szCs w:val="21"/>
-                    </w:rPr>
-                    <w:t>下部署</w:t>
-                  </w:r>
-                  <w:proofErr w:type="gramEnd"/>
-                  <w:r>
-                    <w:rPr>
-                      <w:rFonts w:ascii="Times New Roman" w:hAnsi="Times New Roman" w:cs="Times New Roman" w:hint="eastAsia"/>
-                      <w:sz w:val="21"/>
-                      <w:szCs w:val="21"/>
-                    </w:rPr>
-                    <w:t>和操作的实践经验</w:t>
+                    <w:t>环境下部署和操作的实践经验</w:t>
                   </w:r>
                 </w:p>
               </w:tc>
@@ -3218,6 +3174,7 @@
                     </w:rPr>
                     <w:t>、</w:t>
                   </w:r>
+                  <w:proofErr w:type="spellStart"/>
                   <w:r>
                     <w:rPr>
                       <w:rFonts w:ascii="Times New Roman" w:hAnsi="Times New Roman" w:cs="Times New Roman" w:hint="eastAsia"/>
@@ -3226,6 +3183,7 @@
                     </w:rPr>
                     <w:t>nmap</w:t>
                   </w:r>
+                  <w:proofErr w:type="spellEnd"/>
                   <w:r>
                     <w:rPr>
                       <w:rFonts w:ascii="Times New Roman" w:hAnsi="Times New Roman" w:cs="Times New Roman" w:hint="eastAsia"/>
@@ -3234,6 +3192,7 @@
                     </w:rPr>
                     <w:t>、</w:t>
                   </w:r>
+                  <w:proofErr w:type="spellStart"/>
                   <w:r>
                     <w:rPr>
                       <w:rFonts w:ascii="Times New Roman" w:hAnsi="Times New Roman" w:cs="Times New Roman"/>
@@ -3242,6 +3201,7 @@
                     </w:rPr>
                     <w:t>wireshark</w:t>
                   </w:r>
+                  <w:proofErr w:type="spellEnd"/>
                   <w:r>
                     <w:rPr>
                       <w:rFonts w:ascii="Tahoma" w:hAnsi="Tahoma" w:cs="Tahoma" w:hint="eastAsia"/>
@@ -3250,6 +3210,7 @@
                     </w:rPr>
                     <w:t>、</w:t>
                   </w:r>
+                  <w:proofErr w:type="spellStart"/>
                   <w:r>
                     <w:rPr>
                       <w:rFonts w:ascii="Times New Roman" w:hAnsi="Times New Roman" w:cs="Times New Roman"/>
@@ -3258,6 +3219,7 @@
                     </w:rPr>
                     <w:t>SearchSploit</w:t>
                   </w:r>
+                  <w:proofErr w:type="spellEnd"/>
                   <w:r>
                     <w:rPr>
                       <w:rFonts w:ascii="Times New Roman" w:hAnsi="Times New Roman" w:cs="Times New Roman" w:hint="eastAsia"/>
@@ -3266,6 +3228,7 @@
                     </w:rPr>
                     <w:t>、</w:t>
                   </w:r>
+                  <w:proofErr w:type="spellStart"/>
                   <w:r>
                     <w:rPr>
                       <w:rFonts w:ascii="Times New Roman" w:hAnsi="Times New Roman" w:cs="Times New Roman" w:hint="eastAsia"/>
@@ -3274,6 +3237,7 @@
                     </w:rPr>
                     <w:t>netcat</w:t>
                   </w:r>
+                  <w:proofErr w:type="spellEnd"/>
                   <w:r>
                     <w:rPr>
                       <w:rFonts w:ascii="Times New Roman" w:hAnsi="Times New Roman" w:cs="Times New Roman" w:hint="eastAsia"/>
@@ -3457,35 +3421,35 @@
                       <w:szCs w:val="21"/>
                     </w:rPr>
                   </w:pPr>
-                  <w:proofErr w:type="gramStart"/>
                   <w:r>
                     <w:rPr>
                       <w:rFonts w:ascii="Tahoma" w:hAnsi="Tahoma" w:cs="Tahoma" w:hint="eastAsia"/>
                       <w:sz w:val="21"/>
                       <w:szCs w:val="21"/>
                     </w:rPr>
-                    <w:t>刷题记录</w:t>
-                  </w:r>
-                  <w:proofErr w:type="gramEnd"/>
-                  <w:r>
-                    <w:rPr>
-                      <w:rFonts w:ascii="Tahoma" w:hAnsi="Tahoma" w:cs="Tahoma" w:hint="eastAsia"/>
-                      <w:sz w:val="21"/>
-                      <w:szCs w:val="21"/>
-                    </w:rPr>
-                    <w:t>：</w:t>
-                  </w:r>
-                  <w:hyperlink r:id="rId10" w:history="1">
-                    <w:r>
-                      <w:rPr>
-                        <w:rStyle w:val="a7"/>
-                        <w:rFonts w:ascii="Tahoma" w:hAnsi="Tahoma" w:cs="Tahoma"/>
-                        <w:sz w:val="21"/>
-                        <w:szCs w:val="21"/>
-                      </w:rPr>
-                      <w:t>https://leetcode.cn/u/yi-ma-zgy/</w:t>
-                    </w:r>
-                  </w:hyperlink>
+                    <w:t>刷题记录：</w:t>
+                  </w:r>
+                  <w:r>
+                    <w:fldChar w:fldCharType="begin"/>
+                  </w:r>
+                  <w:r>
+                    <w:instrText>HYPERLINK "https://leetcode.cn/u/yi-ma-zgy/"</w:instrText>
+                  </w:r>
+                  <w:r>
+                    <w:fldChar w:fldCharType="separate"/>
+                  </w:r>
+                  <w:r>
+                    <w:rPr>
+                      <w:rStyle w:val="Hyperlink"/>
+                      <w:rFonts w:ascii="Tahoma" w:hAnsi="Tahoma" w:cs="Tahoma"/>
+                      <w:sz w:val="21"/>
+                      <w:szCs w:val="21"/>
+                    </w:rPr>
+                    <w:t>https://leetcode.cn/u/yi-ma-zgy/</w:t>
+                  </w:r>
+                  <w:r>
+                    <w:fldChar w:fldCharType="end"/>
+                  </w:r>
                 </w:p>
               </w:tc>
             </w:tr>
@@ -3571,6 +3535,7 @@
                     </w:rPr>
                     <w:t>使用</w:t>
                   </w:r>
+                  <w:proofErr w:type="spellStart"/>
                   <w:r>
                     <w:rPr>
                       <w:rFonts w:ascii="Times New Roman" w:hAnsi="Times New Roman" w:cs="Times New Roman" w:hint="eastAsia"/>
@@ -3579,6 +3544,7 @@
                     </w:rPr>
                     <w:t>mysql</w:t>
                   </w:r>
+                  <w:proofErr w:type="spellEnd"/>
                   <w:r>
                     <w:rPr>
                       <w:rFonts w:ascii="Times New Roman" w:hAnsi="Times New Roman" w:cs="Times New Roman" w:hint="eastAsia"/>
@@ -3716,7 +3682,7 @@
             <w:pPr>
               <w:spacing w:line="360" w:lineRule="atLeast"/>
               <w:rPr>
-                <w:rFonts w:ascii="华文细黑" w:eastAsia="华文细黑" w:hAnsi="Times New Roman" w:cs="华文细黑"/>
+                <w:rFonts w:ascii="STXihei" w:eastAsia="STXihei" w:hAnsi="Times New Roman" w:cs="STXihei"/>
                 <w:color w:val="A64D79"/>
                 <w:sz w:val="36"/>
                 <w:szCs w:val="36"/>
@@ -3724,7 +3690,7 @@
             </w:pPr>
             <w:r>
               <w:rPr>
-                <w:rFonts w:ascii="华文细黑" w:eastAsia="华文细黑" w:hAnsi="Times New Roman" w:cs="华文细黑" w:hint="eastAsia"/>
+                <w:rFonts w:ascii="STXihei" w:eastAsia="STXihei" w:hAnsi="Times New Roman" w:cs="STXihei" w:hint="eastAsia"/>
                 <w:b/>
                 <w:bCs/>
                 <w:color w:val="A64D79"/>
@@ -3735,7 +3701,7 @@
             </w:r>
             <w:r>
               <w:rPr>
-                <w:rFonts w:ascii="华文细黑" w:eastAsia="华文细黑" w:hAnsi="Times New Roman" w:cs="华文细黑" w:hint="eastAsia"/>
+                <w:rFonts w:ascii="STXihei" w:eastAsia="STXihei" w:hAnsi="Times New Roman" w:cs="STXihei" w:hint="eastAsia"/>
                 <w:b/>
                 <w:bCs/>
                 <w:color w:val="A64D79"/>
@@ -3789,7 +3755,7 @@
     </w:p>
     <w:tbl>
       <w:tblPr>
-        <w:tblStyle w:val="a9"/>
+        <w:tblStyle w:val="TableGrid"/>
         <w:tblW w:w="9498" w:type="dxa"/>
         <w:tblInd w:w="108" w:type="dxa"/>
         <w:tblBorders>
@@ -3804,9 +3770,9 @@
         <w:tblLook w:val="0020" w:firstRow="1" w:lastRow="0" w:firstColumn="0" w:lastColumn="0" w:noHBand="0" w:noVBand="0"/>
       </w:tblPr>
       <w:tblGrid>
-        <w:gridCol w:w="1593"/>
-        <w:gridCol w:w="567"/>
-        <w:gridCol w:w="1101"/>
+        <w:gridCol w:w="1452"/>
+        <w:gridCol w:w="141"/>
+        <w:gridCol w:w="1668"/>
         <w:gridCol w:w="115"/>
         <w:gridCol w:w="3581"/>
         <w:gridCol w:w="355"/>
@@ -3826,16 +3792,16 @@
           </w:tcPr>
           <w:tbl>
             <w:tblPr>
-              <w:tblStyle w:val="a9"/>
+              <w:tblStyle w:val="TableGrid"/>
               <w:tblW w:w="9356" w:type="dxa"/>
               <w:tblInd w:w="108" w:type="dxa"/>
               <w:tblLayout w:type="fixed"/>
               <w:tblLook w:val="0020" w:firstRow="1" w:lastRow="0" w:firstColumn="0" w:lastColumn="0" w:noHBand="0" w:noVBand="0"/>
             </w:tblPr>
             <w:tblGrid>
-              <w:gridCol w:w="1365"/>
-              <w:gridCol w:w="438"/>
-              <w:gridCol w:w="1784"/>
+              <w:gridCol w:w="1232"/>
+              <w:gridCol w:w="133"/>
+              <w:gridCol w:w="2222"/>
               <w:gridCol w:w="4050"/>
               <w:gridCol w:w="1719"/>
             </w:tblGrid>
@@ -3999,6 +3965,7 @@
               <w:tc>
                 <w:tcPr>
                   <w:tcW w:w="1365" w:type="dxa"/>
+                  <w:gridSpan w:val="2"/>
                   <w:tcBorders>
                     <w:top w:val="nil"/>
                     <w:left w:val="nil"/>
@@ -4024,7 +3991,7 @@
               <w:tc>
                 <w:tcPr>
                   <w:tcW w:w="6272" w:type="dxa"/>
-                  <w:gridSpan w:val="3"/>
+                  <w:gridSpan w:val="2"/>
                   <w:tcBorders>
                     <w:top w:val="nil"/>
                     <w:left w:val="nil"/>
@@ -4054,31 +4021,7 @@
                       <w:sz w:val="22"/>
                       <w:szCs w:val="22"/>
                     </w:rPr>
-                    <w:t>中国移动信息技术中心</w:t>
-                  </w:r>
-                  <w:proofErr w:type="gramStart"/>
-                  <w:r>
-                    <w:rPr>
-                      <w:rFonts w:ascii="Tahoma" w:hAnsi="Tahoma" w:cs="Tahoma" w:hint="eastAsia"/>
-                      <w:b/>
-                      <w:bCs/>
-                      <w:color w:val="444444"/>
-                      <w:sz w:val="22"/>
-                      <w:szCs w:val="22"/>
-                    </w:rPr>
-                    <w:t>网安实</w:t>
-                  </w:r>
-                  <w:proofErr w:type="gramEnd"/>
-                  <w:r>
-                    <w:rPr>
-                      <w:rFonts w:ascii="Tahoma" w:hAnsi="Tahoma" w:cs="Tahoma" w:hint="eastAsia"/>
-                      <w:b/>
-                      <w:bCs/>
-                      <w:color w:val="444444"/>
-                      <w:sz w:val="22"/>
-                      <w:szCs w:val="22"/>
-                    </w:rPr>
-                    <w:t>训营</w:t>
+                    <w:t>中国移动信息技术中心网安实训营</w:t>
                   </w:r>
                 </w:p>
               </w:tc>
@@ -4115,8 +4058,7 @@
               </w:trPr>
               <w:tc>
                 <w:tcPr>
-                  <w:tcW w:w="1803" w:type="dxa"/>
-                  <w:gridSpan w:val="2"/>
+                  <w:tcW w:w="1232" w:type="dxa"/>
                   <w:tcBorders>
                     <w:top w:val="nil"/>
                     <w:left w:val="nil"/>
@@ -4143,8 +4085,8 @@
               </w:tc>
               <w:tc>
                 <w:tcPr>
-                  <w:tcW w:w="7553" w:type="dxa"/>
-                  <w:gridSpan w:val="3"/>
+                  <w:tcW w:w="8124" w:type="dxa"/>
+                  <w:gridSpan w:val="4"/>
                   <w:tcBorders>
                     <w:top w:val="nil"/>
                     <w:left w:val="nil"/>
@@ -4183,8 +4125,7 @@
             <w:tr>
               <w:tc>
                 <w:tcPr>
-                  <w:tcW w:w="1803" w:type="dxa"/>
-                  <w:gridSpan w:val="2"/>
+                  <w:tcW w:w="1232" w:type="dxa"/>
                   <w:tcBorders>
                     <w:top w:val="nil"/>
                     <w:left w:val="nil"/>
@@ -4211,8 +4152,8 @@
               </w:tc>
               <w:tc>
                 <w:tcPr>
-                  <w:tcW w:w="7553" w:type="dxa"/>
-                  <w:gridSpan w:val="3"/>
+                  <w:tcW w:w="8124" w:type="dxa"/>
+                  <w:gridSpan w:val="4"/>
                   <w:tcBorders>
                     <w:top w:val="nil"/>
                     <w:left w:val="nil"/>
@@ -4307,8 +4248,7 @@
             <w:tr>
               <w:tc>
                 <w:tcPr>
-                  <w:tcW w:w="1803" w:type="dxa"/>
-                  <w:gridSpan w:val="2"/>
+                  <w:tcW w:w="1232" w:type="dxa"/>
                   <w:tcBorders>
                     <w:top w:val="nil"/>
                     <w:left w:val="nil"/>
@@ -4335,8 +4275,8 @@
               </w:tc>
               <w:tc>
                 <w:tcPr>
-                  <w:tcW w:w="7553" w:type="dxa"/>
-                  <w:gridSpan w:val="3"/>
+                  <w:tcW w:w="8124" w:type="dxa"/>
+                  <w:gridSpan w:val="4"/>
                   <w:tcBorders>
                     <w:top w:val="nil"/>
                     <w:left w:val="nil"/>
@@ -4385,41 +4325,13 @@
                     </w:rPr>
                     <w:t>XSS</w:t>
                   </w:r>
-                  <w:proofErr w:type="gramStart"/>
                   <w:r>
                     <w:rPr>
                       <w:rFonts w:ascii="Tahoma" w:hAnsi="Tahoma" w:cs="Tahoma" w:hint="eastAsia"/>
                       <w:sz w:val="21"/>
                       <w:szCs w:val="21"/>
                     </w:rPr>
-                    <w:t>跨站脚本</w:t>
-                  </w:r>
-                  <w:proofErr w:type="gramEnd"/>
-                  <w:r>
-                    <w:rPr>
-                      <w:rFonts w:ascii="Tahoma" w:hAnsi="Tahoma" w:cs="Tahoma" w:hint="eastAsia"/>
-                      <w:sz w:val="21"/>
-                      <w:szCs w:val="21"/>
-                    </w:rPr>
-                    <w:t>攻击、上传漏洞攻击，了解攻</w:t>
-                  </w:r>
-                </w:p>
-                <w:p>
-                  <w:pPr>
-                    <w:spacing w:line="252" w:lineRule="atLeast"/>
-                    <w:rPr>
-                      <w:rFonts w:ascii="Tahoma" w:hAnsi="Tahoma" w:cs="Tahoma"/>
-                      <w:sz w:val="21"/>
-                      <w:szCs w:val="21"/>
-                    </w:rPr>
-                  </w:pPr>
-                  <w:r>
-                    <w:rPr>
-                      <w:rFonts w:ascii="Tahoma" w:hAnsi="Tahoma" w:cs="Tahoma" w:hint="eastAsia"/>
-                      <w:sz w:val="21"/>
-                      <w:szCs w:val="21"/>
-                    </w:rPr>
-                    <w:t>击的原理及其防护手段</w:t>
+                    <w:t>跨站脚本攻击、上传漏洞攻击，了解攻击的原理及其防护手段</w:t>
                   </w:r>
                   <w:r>
                     <w:rPr>
@@ -4622,6 +4534,7 @@
         <w:tc>
           <w:tcPr>
             <w:tcW w:w="1593" w:type="dxa"/>
+            <w:gridSpan w:val="2"/>
           </w:tcPr>
           <w:p>
             <w:pPr>
@@ -4641,7 +4554,7 @@
         <w:tc>
           <w:tcPr>
             <w:tcW w:w="5364" w:type="dxa"/>
-            <w:gridSpan w:val="4"/>
+            <w:gridSpan w:val="3"/>
             <w:shd w:val="clear" w:color="auto" w:fill="EAD1DC"/>
           </w:tcPr>
           <w:p>
@@ -4720,8 +4633,7 @@
         </w:trPr>
         <w:tc>
           <w:tcPr>
-            <w:tcW w:w="2160" w:type="dxa"/>
-            <w:gridSpan w:val="2"/>
+            <w:tcW w:w="1452" w:type="dxa"/>
           </w:tcPr>
           <w:p>
             <w:pPr>
@@ -4744,8 +4656,8 @@
         </w:tc>
         <w:tc>
           <w:tcPr>
-            <w:tcW w:w="7196" w:type="dxa"/>
-            <w:gridSpan w:val="5"/>
+            <w:tcW w:w="7904" w:type="dxa"/>
+            <w:gridSpan w:val="6"/>
           </w:tcPr>
           <w:p>
             <w:pPr>
@@ -4764,6 +4676,7 @@
               </w:rPr>
               <w:t>使用</w:t>
             </w:r>
+            <w:proofErr w:type="spellStart"/>
             <w:r>
               <w:rPr>
                 <w:rFonts w:ascii="Tahoma" w:hAnsi="Tahoma" w:cs="Tahoma"/>
@@ -4772,24 +4685,15 @@
               </w:rPr>
               <w:t>wireshark</w:t>
             </w:r>
-            <w:r>
-              <w:rPr>
-                <w:rFonts w:ascii="Tahoma" w:hAnsi="Tahoma" w:cs="Tahoma" w:hint="eastAsia"/>
-                <w:sz w:val="21"/>
-                <w:szCs w:val="21"/>
-              </w:rPr>
-              <w:t>进行抓</w:t>
-            </w:r>
-            <w:proofErr w:type="gramStart"/>
-            <w:r>
-              <w:rPr>
-                <w:rFonts w:ascii="Tahoma" w:hAnsi="Tahoma" w:cs="Tahoma" w:hint="eastAsia"/>
-                <w:sz w:val="21"/>
-                <w:szCs w:val="21"/>
-              </w:rPr>
-              <w:t>包分析</w:t>
-            </w:r>
-            <w:proofErr w:type="gramEnd"/>
+            <w:proofErr w:type="spellEnd"/>
+            <w:r>
+              <w:rPr>
+                <w:rFonts w:ascii="Tahoma" w:hAnsi="Tahoma" w:cs="Tahoma" w:hint="eastAsia"/>
+                <w:sz w:val="21"/>
+                <w:szCs w:val="21"/>
+              </w:rPr>
+              <w:t>进行抓包分析</w:t>
+            </w:r>
             <w:r>
               <w:rPr>
                 <w:rFonts w:ascii="Tahoma" w:hAnsi="Tahoma" w:cs="Tahoma"/>
@@ -4852,18 +4756,8 @@
                 <w:sz w:val="21"/>
                 <w:szCs w:val="21"/>
               </w:rPr>
-              <w:t>，了解了各个协议的工作原理及其</w:t>
-            </w:r>
-            <w:proofErr w:type="gramStart"/>
-            <w:r>
-              <w:rPr>
-                <w:rFonts w:ascii="Tahoma" w:hAnsi="Tahoma" w:cs="Tahoma" w:hint="eastAsia"/>
-                <w:sz w:val="21"/>
-                <w:szCs w:val="21"/>
-              </w:rPr>
-              <w:t>包特征</w:t>
-            </w:r>
-            <w:proofErr w:type="gramEnd"/>
+              <w:t>，了解了各个协议的工作原理及其包特征</w:t>
+            </w:r>
           </w:p>
         </w:tc>
       </w:tr>
@@ -4874,8 +4768,7 @@
         </w:trPr>
         <w:tc>
           <w:tcPr>
-            <w:tcW w:w="2160" w:type="dxa"/>
-            <w:gridSpan w:val="2"/>
+            <w:tcW w:w="1452" w:type="dxa"/>
           </w:tcPr>
           <w:p>
             <w:pPr>
@@ -4895,8 +4788,8 @@
         </w:tc>
         <w:tc>
           <w:tcPr>
-            <w:tcW w:w="7196" w:type="dxa"/>
-            <w:gridSpan w:val="5"/>
+            <w:tcW w:w="7904" w:type="dxa"/>
+            <w:gridSpan w:val="6"/>
           </w:tcPr>
           <w:p>
             <w:pPr>
@@ -4931,6 +4824,7 @@
               </w:rPr>
               <w:t>配合</w:t>
             </w:r>
+            <w:proofErr w:type="spellStart"/>
             <w:r>
               <w:rPr>
                 <w:rFonts w:ascii="Tahoma" w:hAnsi="Tahoma" w:cs="Tahoma"/>
@@ -4939,6 +4833,7 @@
               </w:rPr>
               <w:t>wireshark</w:t>
             </w:r>
+            <w:proofErr w:type="spellEnd"/>
             <w:r>
               <w:rPr>
                 <w:rFonts w:ascii="Tahoma" w:hAnsi="Tahoma" w:cs="Tahoma" w:hint="eastAsia"/>
@@ -4957,8 +4852,7 @@
         </w:trPr>
         <w:tc>
           <w:tcPr>
-            <w:tcW w:w="2160" w:type="dxa"/>
-            <w:gridSpan w:val="2"/>
+            <w:tcW w:w="1452" w:type="dxa"/>
           </w:tcPr>
           <w:p>
             <w:pPr>
@@ -4978,8 +4872,8 @@
         </w:tc>
         <w:tc>
           <w:tcPr>
-            <w:tcW w:w="7196" w:type="dxa"/>
-            <w:gridSpan w:val="5"/>
+            <w:tcW w:w="7904" w:type="dxa"/>
+            <w:gridSpan w:val="6"/>
           </w:tcPr>
           <w:p>
             <w:pPr>
@@ -5014,6 +4908,7 @@
               </w:rPr>
               <w:t>、</w:t>
             </w:r>
+            <w:proofErr w:type="spellStart"/>
             <w:r>
               <w:rPr>
                 <w:rFonts w:ascii="Tahoma" w:hAnsi="Tahoma" w:cs="Tahoma"/>
@@ -5022,6 +4917,7 @@
               </w:rPr>
               <w:t>DDos</w:t>
             </w:r>
+            <w:proofErr w:type="spellEnd"/>
             <w:r>
               <w:rPr>
                 <w:rFonts w:ascii="Tahoma" w:hAnsi="Tahoma" w:cs="Tahoma" w:hint="eastAsia"/>
@@ -5136,8 +5032,7 @@
         </w:trPr>
         <w:tc>
           <w:tcPr>
-            <w:tcW w:w="2160" w:type="dxa"/>
-            <w:gridSpan w:val="2"/>
+            <w:tcW w:w="1452" w:type="dxa"/>
           </w:tcPr>
           <w:p>
             <w:pPr>
@@ -5157,8 +5052,8 @@
         </w:tc>
         <w:tc>
           <w:tcPr>
-            <w:tcW w:w="7196" w:type="dxa"/>
-            <w:gridSpan w:val="5"/>
+            <w:tcW w:w="7904" w:type="dxa"/>
+            <w:gridSpan w:val="6"/>
           </w:tcPr>
           <w:p>
             <w:pPr>
@@ -5177,6 +5072,7 @@
               </w:rPr>
               <w:t>学会使用</w:t>
             </w:r>
+            <w:proofErr w:type="spellStart"/>
             <w:r>
               <w:rPr>
                 <w:rFonts w:ascii="Tahoma" w:hAnsi="Tahoma" w:cs="Tahoma"/>
@@ -5185,6 +5081,7 @@
               </w:rPr>
               <w:t>nmap</w:t>
             </w:r>
+            <w:proofErr w:type="spellEnd"/>
             <w:r>
               <w:rPr>
                 <w:rFonts w:ascii="Tahoma" w:hAnsi="Tahoma" w:cs="Tahoma" w:hint="eastAsia"/>
@@ -5193,6 +5090,7 @@
               </w:rPr>
               <w:t>、</w:t>
             </w:r>
+            <w:proofErr w:type="spellStart"/>
             <w:r>
               <w:rPr>
                 <w:rFonts w:ascii="Tahoma" w:hAnsi="Tahoma" w:cs="Tahoma" w:hint="eastAsia"/>
@@ -5201,6 +5099,7 @@
               </w:rPr>
               <w:t>netcat</w:t>
             </w:r>
+            <w:proofErr w:type="spellEnd"/>
             <w:r>
               <w:rPr>
                 <w:rFonts w:ascii="Tahoma" w:hAnsi="Tahoma" w:cs="Tahoma" w:hint="eastAsia"/>
@@ -5235,8 +5134,7 @@
         </w:trPr>
         <w:tc>
           <w:tcPr>
-            <w:tcW w:w="2160" w:type="dxa"/>
-            <w:gridSpan w:val="2"/>
+            <w:tcW w:w="1452" w:type="dxa"/>
           </w:tcPr>
           <w:p>
             <w:pPr>
@@ -5256,8 +5154,8 @@
         </w:tc>
         <w:tc>
           <w:tcPr>
-            <w:tcW w:w="7196" w:type="dxa"/>
-            <w:gridSpan w:val="5"/>
+            <w:tcW w:w="7904" w:type="dxa"/>
+            <w:gridSpan w:val="6"/>
           </w:tcPr>
           <w:p>
             <w:pPr>
@@ -5276,6 +5174,7 @@
               </w:rPr>
               <w:t>学会</w:t>
             </w:r>
+            <w:proofErr w:type="spellStart"/>
             <w:r>
               <w:rPr>
                 <w:rFonts w:ascii="Tahoma" w:hAnsi="Tahoma" w:cs="Tahoma"/>
@@ -5284,6 +5183,7 @@
               </w:rPr>
               <w:t>arp</w:t>
             </w:r>
+            <w:proofErr w:type="spellEnd"/>
             <w:r>
               <w:rPr>
                 <w:rFonts w:ascii="Tahoma" w:hAnsi="Tahoma" w:cs="Tahoma" w:hint="eastAsia"/>
@@ -5292,6 +5192,7 @@
               </w:rPr>
               <w:t>中间人攻击背后的原理，以及利用</w:t>
             </w:r>
+            <w:proofErr w:type="spellStart"/>
             <w:r>
               <w:rPr>
                 <w:rFonts w:ascii="Tahoma" w:hAnsi="Tahoma" w:cs="Tahoma"/>
@@ -5300,6 +5201,7 @@
               </w:rPr>
               <w:t>ettercat</w:t>
             </w:r>
+            <w:proofErr w:type="spellEnd"/>
             <w:r>
               <w:rPr>
                 <w:rFonts w:ascii="Tahoma" w:hAnsi="Tahoma" w:cs="Tahoma" w:hint="eastAsia"/>
@@ -5503,6 +5405,7 @@
         <w:tc>
           <w:tcPr>
             <w:tcW w:w="1593" w:type="dxa"/>
+            <w:gridSpan w:val="2"/>
           </w:tcPr>
           <w:p>
             <w:pPr>
@@ -5522,7 +5425,7 @@
         <w:tc>
           <w:tcPr>
             <w:tcW w:w="5719" w:type="dxa"/>
-            <w:gridSpan w:val="5"/>
+            <w:gridSpan w:val="4"/>
             <w:shd w:val="clear" w:color="auto" w:fill="EAD1DC"/>
           </w:tcPr>
           <w:p>
@@ -5590,8 +5493,7 @@
         </w:trPr>
         <w:tc>
           <w:tcPr>
-            <w:tcW w:w="2160" w:type="dxa"/>
-            <w:gridSpan w:val="2"/>
+            <w:tcW w:w="1452" w:type="dxa"/>
           </w:tcPr>
           <w:p>
             <w:pPr>
@@ -5614,8 +5516,8 @@
         </w:tc>
         <w:tc>
           <w:tcPr>
-            <w:tcW w:w="7196" w:type="dxa"/>
-            <w:gridSpan w:val="5"/>
+            <w:tcW w:w="7904" w:type="dxa"/>
+            <w:gridSpan w:val="6"/>
           </w:tcPr>
           <w:p>
             <w:pPr>
@@ -5684,8 +5586,7 @@
         </w:trPr>
         <w:tc>
           <w:tcPr>
-            <w:tcW w:w="2160" w:type="dxa"/>
-            <w:gridSpan w:val="2"/>
+            <w:tcW w:w="1452" w:type="dxa"/>
           </w:tcPr>
           <w:p>
             <w:pPr>
@@ -5708,14 +5609,14 @@
         </w:tc>
         <w:tc>
           <w:tcPr>
-            <w:tcW w:w="7196" w:type="dxa"/>
-            <w:gridSpan w:val="5"/>
+            <w:tcW w:w="7904" w:type="dxa"/>
+            <w:gridSpan w:val="6"/>
           </w:tcPr>
           <w:p>
             <w:pPr>
               <w:spacing w:line="252" w:lineRule="atLeast"/>
               <w:rPr>
-                <w:rFonts w:ascii="Tahoma" w:hAnsi="Tahoma" w:cs="Tahoma" w:hint="eastAsia"/>
+                <w:rFonts w:ascii="Tahoma" w:hAnsi="Tahoma" w:cs="Tahoma"/>
                 <w:sz w:val="21"/>
                 <w:szCs w:val="21"/>
               </w:rPr>
@@ -5728,6 +5629,7 @@
               </w:rPr>
               <w:t>通过</w:t>
             </w:r>
+            <w:proofErr w:type="spellStart"/>
             <w:r>
               <w:rPr>
                 <w:rFonts w:ascii="Tahoma" w:hAnsi="Tahoma" w:cs="Tahoma" w:hint="eastAsia"/>
@@ -5736,6 +5638,7 @@
               </w:rPr>
               <w:t>ensp</w:t>
             </w:r>
+            <w:proofErr w:type="spellEnd"/>
             <w:r>
               <w:rPr>
                 <w:rFonts w:ascii="Tahoma" w:hAnsi="Tahoma" w:cs="Tahoma" w:hint="eastAsia"/>
@@ -5786,8 +5689,7 @@
         </w:trPr>
         <w:tc>
           <w:tcPr>
-            <w:tcW w:w="2160" w:type="dxa"/>
-            <w:gridSpan w:val="2"/>
+            <w:tcW w:w="1452" w:type="dxa"/>
           </w:tcPr>
           <w:p>
             <w:pPr>
@@ -5807,8 +5709,8 @@
         </w:tc>
         <w:tc>
           <w:tcPr>
-            <w:tcW w:w="7196" w:type="dxa"/>
-            <w:gridSpan w:val="5"/>
+            <w:tcW w:w="7904" w:type="dxa"/>
+            <w:gridSpan w:val="6"/>
           </w:tcPr>
           <w:p>
             <w:pPr>
@@ -5877,8 +5779,7 @@
         </w:trPr>
         <w:tc>
           <w:tcPr>
-            <w:tcW w:w="2160" w:type="dxa"/>
-            <w:gridSpan w:val="2"/>
+            <w:tcW w:w="1452" w:type="dxa"/>
           </w:tcPr>
           <w:p>
             <w:pPr>
@@ -5898,8 +5799,8 @@
         </w:tc>
         <w:tc>
           <w:tcPr>
-            <w:tcW w:w="7196" w:type="dxa"/>
-            <w:gridSpan w:val="5"/>
+            <w:tcW w:w="7904" w:type="dxa"/>
+            <w:gridSpan w:val="6"/>
           </w:tcPr>
           <w:p>
             <w:pPr>
@@ -6008,8 +5909,7 @@
         </w:trPr>
         <w:tc>
           <w:tcPr>
-            <w:tcW w:w="2160" w:type="dxa"/>
-            <w:gridSpan w:val="2"/>
+            <w:tcW w:w="1452" w:type="dxa"/>
           </w:tcPr>
           <w:p>
             <w:pPr>
@@ -6029,8 +5929,8 @@
         </w:tc>
         <w:tc>
           <w:tcPr>
-            <w:tcW w:w="7196" w:type="dxa"/>
-            <w:gridSpan w:val="5"/>
+            <w:tcW w:w="7904" w:type="dxa"/>
+            <w:gridSpan w:val="6"/>
           </w:tcPr>
           <w:p>
             <w:pPr>
@@ -6049,6 +5949,7 @@
               </w:rPr>
               <w:t>设计</w:t>
             </w:r>
+            <w:proofErr w:type="spellStart"/>
             <w:r>
               <w:rPr>
                 <w:rFonts w:ascii="Tahoma" w:hAnsi="Tahoma" w:cs="Tahoma" w:hint="eastAsia"/>
@@ -6057,6 +5958,7 @@
               </w:rPr>
               <w:t>vrrp</w:t>
             </w:r>
+            <w:proofErr w:type="spellEnd"/>
             <w:r>
               <w:rPr>
                 <w:rFonts w:ascii="Tahoma" w:hAnsi="Tahoma" w:cs="Tahoma" w:hint="eastAsia"/>
@@ -6075,8 +5977,7 @@
         </w:trPr>
         <w:tc>
           <w:tcPr>
-            <w:tcW w:w="2160" w:type="dxa"/>
-            <w:gridSpan w:val="2"/>
+            <w:tcW w:w="1452" w:type="dxa"/>
           </w:tcPr>
           <w:p>
             <w:pPr>
@@ -6096,8 +5997,8 @@
         </w:tc>
         <w:tc>
           <w:tcPr>
-            <w:tcW w:w="7196" w:type="dxa"/>
-            <w:gridSpan w:val="5"/>
+            <w:tcW w:w="7904" w:type="dxa"/>
+            <w:gridSpan w:val="6"/>
           </w:tcPr>
           <w:p>
             <w:pPr>
@@ -6143,8 +6044,7 @@
         </w:trPr>
         <w:tc>
           <w:tcPr>
-            <w:tcW w:w="2160" w:type="dxa"/>
-            <w:gridSpan w:val="2"/>
+            <w:tcW w:w="1452" w:type="dxa"/>
           </w:tcPr>
           <w:p>
             <w:pPr>
@@ -6164,14 +6064,14 @@
         </w:tc>
         <w:tc>
           <w:tcPr>
-            <w:tcW w:w="7196" w:type="dxa"/>
-            <w:gridSpan w:val="5"/>
+            <w:tcW w:w="7904" w:type="dxa"/>
+            <w:gridSpan w:val="6"/>
           </w:tcPr>
           <w:p>
             <w:pPr>
               <w:spacing w:line="252" w:lineRule="atLeast"/>
               <w:rPr>
-                <w:rFonts w:ascii="Tahoma" w:hAnsi="Tahoma" w:cs="Tahoma" w:hint="eastAsia"/>
+                <w:rFonts w:ascii="Tahoma" w:hAnsi="Tahoma" w:cs="Tahoma"/>
                 <w:sz w:val="21"/>
                 <w:szCs w:val="21"/>
               </w:rPr>
@@ -6254,15 +6154,7 @@
                 <w:sz w:val="21"/>
                 <w:szCs w:val="21"/>
               </w:rPr>
-              <w:t>，</w:t>
-            </w:r>
-            <w:r>
-              <w:rPr>
-                <w:rFonts w:ascii="Tahoma" w:hAnsi="Tahoma" w:cs="Tahoma" w:hint="eastAsia"/>
-                <w:sz w:val="21"/>
-                <w:szCs w:val="21"/>
-              </w:rPr>
-              <w:t>提高内</w:t>
+              <w:t>，提高内</w:t>
             </w:r>
             <w:r>
               <w:rPr>
@@ -6331,7 +6223,7 @@
                   <w:pPr>
                     <w:spacing w:line="360" w:lineRule="atLeast"/>
                     <w:rPr>
-                      <w:rFonts w:ascii="华文细黑" w:eastAsia="华文细黑" w:hAnsi="Times New Roman" w:cs="华文细黑"/>
+                      <w:rFonts w:ascii="STXihei" w:eastAsia="STXihei" w:hAnsi="Times New Roman" w:cs="STXihei"/>
                       <w:color w:val="A64D79"/>
                       <w:sz w:val="36"/>
                       <w:szCs w:val="36"/>
@@ -6339,7 +6231,7 @@
                   </w:pPr>
                   <w:r>
                     <w:rPr>
-                      <w:rFonts w:ascii="华文细黑" w:eastAsia="华文细黑" w:hAnsi="Times New Roman" w:cs="华文细黑" w:hint="eastAsia"/>
+                      <w:rFonts w:ascii="STXihei" w:eastAsia="STXihei" w:hAnsi="Times New Roman" w:cs="STXihei" w:hint="eastAsia"/>
                       <w:b/>
                       <w:bCs/>
                       <w:color w:val="A64D79"/>
@@ -6350,7 +6242,7 @@
                   </w:r>
                   <w:r>
                     <w:rPr>
-                      <w:rFonts w:ascii="华文细黑" w:eastAsia="华文细黑" w:hAnsi="Times New Roman" w:cs="华文细黑" w:hint="eastAsia"/>
+                      <w:rFonts w:ascii="STXihei" w:eastAsia="STXihei" w:hAnsi="Times New Roman" w:cs="STXihei" w:hint="eastAsia"/>
                       <w:b/>
                       <w:bCs/>
                       <w:color w:val="A64D79"/>
@@ -6436,7 +6328,7 @@
     </w:p>
     <w:tbl>
       <w:tblPr>
-        <w:tblStyle w:val="a9"/>
+        <w:tblStyle w:val="TableGrid"/>
         <w:tblW w:w="9356" w:type="dxa"/>
         <w:tblInd w:w="108" w:type="dxa"/>
         <w:tblBorders>
@@ -6451,9 +6343,9 @@
         <w:tblLook w:val="0020" w:firstRow="1" w:lastRow="0" w:firstColumn="0" w:lastColumn="0" w:noHBand="0" w:noVBand="0"/>
       </w:tblPr>
       <w:tblGrid>
-        <w:gridCol w:w="1775"/>
-        <w:gridCol w:w="493"/>
-        <w:gridCol w:w="1319"/>
+        <w:gridCol w:w="885"/>
+        <w:gridCol w:w="141"/>
+        <w:gridCol w:w="2561"/>
         <w:gridCol w:w="5769"/>
       </w:tblGrid>
       <w:tr>
@@ -6615,7 +6507,8 @@
         </w:trPr>
         <w:tc>
           <w:tcPr>
-            <w:tcW w:w="1775" w:type="dxa"/>
+            <w:tcW w:w="1026" w:type="dxa"/>
+            <w:gridSpan w:val="2"/>
           </w:tcPr>
           <w:p>
             <w:pPr>
@@ -6634,15 +6527,15 @@
         </w:tc>
         <w:tc>
           <w:tcPr>
-            <w:tcW w:w="7581" w:type="dxa"/>
-            <w:gridSpan w:val="3"/>
+            <w:tcW w:w="8330" w:type="dxa"/>
+            <w:gridSpan w:val="2"/>
             <w:shd w:val="clear" w:color="auto" w:fill="EAD1DC"/>
           </w:tcPr>
           <w:p>
             <w:pPr>
               <w:spacing w:line="252" w:lineRule="atLeast"/>
-              <w:ind w:right="660"/>
-              <w:jc w:val="right"/>
+              <w:ind w:right="1100"/>
+              <w:jc w:val="center"/>
               <w:rPr>
                 <w:rFonts w:ascii="Tahoma" w:hAnsi="Tahoma" w:cs="Tahoma"/>
                 <w:b/>
@@ -6661,7 +6554,7 @@
                 <w:sz w:val="22"/>
                 <w:szCs w:val="22"/>
               </w:rPr>
-              <w:t>广州海之光网络股份有限公司</w:t>
+              <w:t xml:space="preserve"> </w:t>
             </w:r>
             <w:r>
               <w:rPr>
@@ -6672,7 +6565,7 @@
                 <w:sz w:val="22"/>
                 <w:szCs w:val="22"/>
               </w:rPr>
-              <w:t xml:space="preserve">                                  </w:t>
+              <w:t>广州海之光网络股份有限公司</w:t>
             </w:r>
             <w:r>
               <w:rPr>
@@ -6683,7 +6576,7 @@
                 <w:sz w:val="22"/>
                 <w:szCs w:val="22"/>
               </w:rPr>
-              <w:t>网络运维实习生</w:t>
+              <w:t xml:space="preserve">                                  </w:t>
             </w:r>
             <w:r>
               <w:rPr>
@@ -6694,6 +6587,17 @@
                 <w:sz w:val="22"/>
                 <w:szCs w:val="22"/>
               </w:rPr>
+              <w:t>网络运维实习生</w:t>
+            </w:r>
+            <w:r>
+              <w:rPr>
+                <w:rFonts w:ascii="Tahoma" w:hAnsi="Tahoma" w:cs="Tahoma" w:hint="eastAsia"/>
+                <w:b/>
+                <w:bCs/>
+                <w:color w:val="444444"/>
+                <w:sz w:val="22"/>
+                <w:szCs w:val="22"/>
+              </w:rPr>
               <w:t xml:space="preserve"> </w:t>
             </w:r>
           </w:p>
@@ -6702,8 +6606,7 @@
       <w:tr>
         <w:tc>
           <w:tcPr>
-            <w:tcW w:w="2268" w:type="dxa"/>
-            <w:gridSpan w:val="2"/>
+            <w:tcW w:w="885" w:type="dxa"/>
           </w:tcPr>
           <w:p>
             <w:pPr>
@@ -6726,14 +6629,14 @@
         </w:tc>
         <w:tc>
           <w:tcPr>
-            <w:tcW w:w="7088" w:type="dxa"/>
-            <w:gridSpan w:val="2"/>
+            <w:tcW w:w="8471" w:type="dxa"/>
+            <w:gridSpan w:val="3"/>
           </w:tcPr>
           <w:p>
             <w:pPr>
               <w:spacing w:line="252" w:lineRule="atLeast"/>
               <w:rPr>
-                <w:rFonts w:ascii="Tahoma" w:hAnsi="Tahoma" w:cs="Tahoma" w:hint="eastAsia"/>
+                <w:rFonts w:ascii="Tahoma" w:hAnsi="Tahoma" w:cs="Tahoma"/>
                 <w:sz w:val="21"/>
                 <w:szCs w:val="21"/>
               </w:rPr>
@@ -6788,7 +6691,25 @@
                 <w:sz w:val="21"/>
                 <w:szCs w:val="21"/>
               </w:rPr>
-              <w:t xml:space="preserve"> Panabit </w:t>
+              <w:t xml:space="preserve"> </w:t>
+            </w:r>
+            <w:proofErr w:type="spellStart"/>
+            <w:r>
+              <w:rPr>
+                <w:rFonts w:ascii="Tahoma" w:hAnsi="Tahoma" w:cs="Tahoma" w:hint="eastAsia"/>
+                <w:sz w:val="21"/>
+                <w:szCs w:val="21"/>
+              </w:rPr>
+              <w:t>Panabit</w:t>
+            </w:r>
+            <w:proofErr w:type="spellEnd"/>
+            <w:r>
+              <w:rPr>
+                <w:rFonts w:ascii="Tahoma" w:hAnsi="Tahoma" w:cs="Tahoma" w:hint="eastAsia"/>
+                <w:sz w:val="21"/>
+                <w:szCs w:val="21"/>
+              </w:rPr>
+              <w:t xml:space="preserve"> </w:t>
             </w:r>
             <w:r>
               <w:rPr>
@@ -6852,7 +6773,25 @@
                 <w:sz w:val="21"/>
                 <w:szCs w:val="21"/>
               </w:rPr>
-              <w:t xml:space="preserve"> Panabit </w:t>
+              <w:t xml:space="preserve"> </w:t>
+            </w:r>
+            <w:proofErr w:type="spellStart"/>
+            <w:r>
+              <w:rPr>
+                <w:rFonts w:ascii="Tahoma" w:hAnsi="Tahoma" w:cs="Tahoma" w:hint="eastAsia"/>
+                <w:sz w:val="21"/>
+                <w:szCs w:val="21"/>
+              </w:rPr>
+              <w:t>Panabit</w:t>
+            </w:r>
+            <w:proofErr w:type="spellEnd"/>
+            <w:r>
+              <w:rPr>
+                <w:rFonts w:ascii="Tahoma" w:hAnsi="Tahoma" w:cs="Tahoma" w:hint="eastAsia"/>
+                <w:sz w:val="21"/>
+                <w:szCs w:val="21"/>
+              </w:rPr>
+              <w:t xml:space="preserve"> </w:t>
             </w:r>
             <w:r>
               <w:rPr>
@@ -6956,25 +6895,7 @@
                 <w:sz w:val="21"/>
                 <w:szCs w:val="21"/>
               </w:rPr>
-              <w:t>小时内</w:t>
-            </w:r>
-            <w:proofErr w:type="gramStart"/>
-            <w:r>
-              <w:rPr>
-                <w:rFonts w:ascii="Tahoma" w:hAnsi="Tahoma" w:cs="Tahoma" w:hint="eastAsia"/>
-                <w:sz w:val="21"/>
-                <w:szCs w:val="21"/>
-              </w:rPr>
-              <w:t>携专业</w:t>
-            </w:r>
-            <w:proofErr w:type="gramEnd"/>
-            <w:r>
-              <w:rPr>
-                <w:rFonts w:ascii="Tahoma" w:hAnsi="Tahoma" w:cs="Tahoma" w:hint="eastAsia"/>
-                <w:sz w:val="21"/>
-                <w:szCs w:val="21"/>
-              </w:rPr>
-              <w:t>设备现场处理</w:t>
+              <w:t>小时内携专业设备现场处理</w:t>
             </w:r>
             <w:r>
               <w:rPr>
@@ -6990,26 +6911,15 @@
                 <w:sz w:val="21"/>
                 <w:szCs w:val="21"/>
               </w:rPr>
-              <w:t>处理回馈始终保持</w:t>
-            </w:r>
-            <w:proofErr w:type="gramStart"/>
-            <w:r>
-              <w:rPr>
-                <w:rFonts w:ascii="Tahoma" w:hAnsi="Tahoma" w:cs="Tahoma" w:hint="eastAsia"/>
-                <w:sz w:val="21"/>
-                <w:szCs w:val="21"/>
-              </w:rPr>
-              <w:t>零差评</w:t>
-            </w:r>
-            <w:proofErr w:type="gramEnd"/>
+              <w:t>处理回馈始终保持零差评</w:t>
+            </w:r>
           </w:p>
         </w:tc>
       </w:tr>
       <w:tr>
         <w:tc>
           <w:tcPr>
-            <w:tcW w:w="2268" w:type="dxa"/>
-            <w:gridSpan w:val="2"/>
+            <w:tcW w:w="885" w:type="dxa"/>
           </w:tcPr>
           <w:p>
             <w:pPr>
@@ -7032,14 +6942,14 @@
         </w:tc>
         <w:tc>
           <w:tcPr>
-            <w:tcW w:w="7088" w:type="dxa"/>
-            <w:gridSpan w:val="2"/>
+            <w:tcW w:w="8471" w:type="dxa"/>
+            <w:gridSpan w:val="3"/>
           </w:tcPr>
           <w:p>
             <w:pPr>
               <w:spacing w:line="252" w:lineRule="atLeast"/>
               <w:rPr>
-                <w:rFonts w:ascii="Tahoma" w:hAnsi="Tahoma" w:cs="Tahoma" w:hint="eastAsia"/>
+                <w:rFonts w:ascii="Tahoma" w:hAnsi="Tahoma" w:cs="Tahoma"/>
                 <w:b/>
                 <w:bCs/>
                 <w:sz w:val="21"/>
@@ -7082,16 +6992,7 @@
                 <w:sz w:val="21"/>
                 <w:szCs w:val="21"/>
               </w:rPr>
-              <w:t>公司</w:t>
-            </w:r>
-            <w:proofErr w:type="gramStart"/>
-            <w:r>
-              <w:rPr>
-                <w:rFonts w:ascii="Tahoma" w:hAnsi="Tahoma" w:cs="Tahoma" w:hint="eastAsia"/>
-                <w:sz w:val="21"/>
-                <w:szCs w:val="21"/>
-              </w:rPr>
-              <w:t>办公网</w:t>
+              <w:t>公司办公网</w:t>
             </w:r>
             <w:r>
               <w:rPr>
@@ -7107,16 +7008,7 @@
                 <w:sz w:val="21"/>
                 <w:szCs w:val="21"/>
               </w:rPr>
-              <w:t>突发</w:t>
-            </w:r>
-            <w:proofErr w:type="gramEnd"/>
-            <w:r>
-              <w:rPr>
-                <w:rFonts w:ascii="Tahoma" w:hAnsi="Tahoma" w:cs="Tahoma" w:hint="eastAsia"/>
-                <w:sz w:val="21"/>
-                <w:szCs w:val="21"/>
-              </w:rPr>
-              <w:t>延迟或告警时</w:t>
+              <w:t>突发延迟或告警时</w:t>
             </w:r>
             <w:r>
               <w:rPr>
@@ -7196,8 +7088,7 @@
       <w:tr>
         <w:tc>
           <w:tcPr>
-            <w:tcW w:w="2268" w:type="dxa"/>
-            <w:gridSpan w:val="2"/>
+            <w:tcW w:w="885" w:type="dxa"/>
           </w:tcPr>
           <w:p>
             <w:pPr>
@@ -7217,8 +7108,8 @@
         </w:tc>
         <w:tc>
           <w:tcPr>
-            <w:tcW w:w="7088" w:type="dxa"/>
-            <w:gridSpan w:val="2"/>
+            <w:tcW w:w="8471" w:type="dxa"/>
+            <w:gridSpan w:val="3"/>
           </w:tcPr>
           <w:p>
             <w:pPr>
@@ -7269,8 +7160,7 @@
       <w:tr>
         <w:tc>
           <w:tcPr>
-            <w:tcW w:w="2268" w:type="dxa"/>
-            <w:gridSpan w:val="2"/>
+            <w:tcW w:w="885" w:type="dxa"/>
           </w:tcPr>
           <w:p>
             <w:pPr>
@@ -7290,8 +7180,8 @@
         </w:tc>
         <w:tc>
           <w:tcPr>
-            <w:tcW w:w="7088" w:type="dxa"/>
-            <w:gridSpan w:val="2"/>
+            <w:tcW w:w="8471" w:type="dxa"/>
+            <w:gridSpan w:val="3"/>
           </w:tcPr>
           <w:p>
             <w:pPr>
@@ -7460,7 +7350,7 @@
             <w:pPr>
               <w:spacing w:line="360" w:lineRule="atLeast"/>
               <w:rPr>
-                <w:rFonts w:ascii="华文细黑" w:eastAsia="华文细黑" w:hAnsi="Times New Roman" w:cs="华文细黑"/>
+                <w:rFonts w:ascii="STXihei" w:eastAsia="STXihei" w:hAnsi="Times New Roman" w:cs="STXihei"/>
                 <w:color w:val="A64D79"/>
                 <w:sz w:val="36"/>
                 <w:szCs w:val="36"/>
@@ -7468,7 +7358,7 @@
             </w:pPr>
             <w:r>
               <w:rPr>
-                <w:rFonts w:ascii="华文细黑" w:eastAsia="华文细黑" w:hAnsi="Times New Roman" w:cs="华文细黑" w:hint="eastAsia"/>
+                <w:rFonts w:ascii="STXihei" w:eastAsia="STXihei" w:hAnsi="Times New Roman" w:cs="STXihei" w:hint="eastAsia"/>
                 <w:b/>
                 <w:bCs/>
                 <w:color w:val="A64D79"/>
@@ -7532,8 +7422,8 @@
         <w:tblLook w:val="0000" w:firstRow="0" w:lastRow="0" w:firstColumn="0" w:lastColumn="0" w:noHBand="0" w:noVBand="0"/>
       </w:tblPr>
       <w:tblGrid>
-        <w:gridCol w:w="1701"/>
-        <w:gridCol w:w="7710"/>
+        <w:gridCol w:w="1134"/>
+        <w:gridCol w:w="8277"/>
       </w:tblGrid>
       <w:tr>
         <w:trPr>
@@ -7541,7 +7431,7 @@
         </w:trPr>
         <w:tc>
           <w:tcPr>
-            <w:tcW w:w="1701" w:type="dxa"/>
+            <w:tcW w:w="1134" w:type="dxa"/>
             <w:tcBorders>
               <w:top w:val="nil"/>
               <w:left w:val="nil"/>
@@ -7569,7 +7459,7 @@
         </w:tc>
         <w:tc>
           <w:tcPr>
-            <w:tcW w:w="7710" w:type="dxa"/>
+            <w:tcW w:w="8277" w:type="dxa"/>
             <w:tcBorders>
               <w:top w:val="nil"/>
               <w:left w:val="nil"/>
@@ -7586,7 +7476,7 @@
           </w:tcPr>
           <w:p>
             <w:pPr>
-              <w:pStyle w:val="aa"/>
+              <w:pStyle w:val="ListParagraph"/>
               <w:numPr>
                 <w:ilvl w:val="0"/>
                 <w:numId w:val="2"/>
@@ -7621,25 +7511,7 @@
                 <w:sz w:val="21"/>
                 <w:szCs w:val="21"/>
               </w:rPr>
-              <w:t>工作极为负责，并且有很强的</w:t>
-            </w:r>
-            <w:proofErr w:type="gramStart"/>
-            <w:r>
-              <w:rPr>
-                <w:rFonts w:ascii="Tahoma" w:hAnsi="Tahoma" w:cs="Tahoma" w:hint="eastAsia"/>
-                <w:sz w:val="21"/>
-                <w:szCs w:val="21"/>
-              </w:rPr>
-              <w:t>进步自</w:t>
-            </w:r>
-            <w:proofErr w:type="gramEnd"/>
-            <w:r>
-              <w:rPr>
-                <w:rFonts w:ascii="Tahoma" w:hAnsi="Tahoma" w:cs="Tahoma" w:hint="eastAsia"/>
-                <w:sz w:val="21"/>
-                <w:szCs w:val="21"/>
-              </w:rPr>
-              <w:t>驱力</w:t>
+              <w:t>工作极为负责，并且有很强的进步自驱力</w:t>
             </w:r>
           </w:p>
         </w:tc>
@@ -7667,8 +7539,8 @@
         <w:tblLook w:val="0000" w:firstRow="0" w:lastRow="0" w:firstColumn="0" w:lastColumn="0" w:noHBand="0" w:noVBand="0"/>
       </w:tblPr>
       <w:tblGrid>
-        <w:gridCol w:w="1701"/>
-        <w:gridCol w:w="7710"/>
+        <w:gridCol w:w="1134"/>
+        <w:gridCol w:w="8277"/>
       </w:tblGrid>
       <w:tr>
         <w:trPr>
@@ -7676,7 +7548,7 @@
         </w:trPr>
         <w:tc>
           <w:tcPr>
-            <w:tcW w:w="1701" w:type="dxa"/>
+            <w:tcW w:w="1134" w:type="dxa"/>
             <w:tcBorders>
               <w:top w:val="nil"/>
               <w:left w:val="nil"/>
@@ -7704,7 +7576,7 @@
         </w:tc>
         <w:tc>
           <w:tcPr>
-            <w:tcW w:w="7710" w:type="dxa"/>
+            <w:tcW w:w="8277" w:type="dxa"/>
             <w:tcBorders>
               <w:top w:val="nil"/>
               <w:left w:val="nil"/>
@@ -7721,7 +7593,7 @@
           </w:tcPr>
           <w:p>
             <w:pPr>
-              <w:pStyle w:val="aa"/>
+              <w:pStyle w:val="ListParagraph"/>
               <w:numPr>
                 <w:ilvl w:val="0"/>
                 <w:numId w:val="2"/>
@@ -7840,8 +7712,8 @@
         <w:tblLook w:val="0000" w:firstRow="0" w:lastRow="0" w:firstColumn="0" w:lastColumn="0" w:noHBand="0" w:noVBand="0"/>
       </w:tblPr>
       <w:tblGrid>
-        <w:gridCol w:w="1701"/>
-        <w:gridCol w:w="7710"/>
+        <w:gridCol w:w="1134"/>
+        <w:gridCol w:w="8277"/>
       </w:tblGrid>
       <w:tr>
         <w:trPr>
@@ -7849,7 +7721,7 @@
         </w:trPr>
         <w:tc>
           <w:tcPr>
-            <w:tcW w:w="1701" w:type="dxa"/>
+            <w:tcW w:w="1134" w:type="dxa"/>
             <w:tcBorders>
               <w:top w:val="nil"/>
               <w:left w:val="nil"/>
@@ -7877,7 +7749,7 @@
         </w:tc>
         <w:tc>
           <w:tcPr>
-            <w:tcW w:w="7710" w:type="dxa"/>
+            <w:tcW w:w="8277" w:type="dxa"/>
             <w:tcBorders>
               <w:top w:val="nil"/>
               <w:left w:val="nil"/>
@@ -7894,7 +7766,7 @@
           </w:tcPr>
           <w:p>
             <w:pPr>
-              <w:pStyle w:val="aa"/>
+              <w:pStyle w:val="ListParagraph"/>
               <w:numPr>
                 <w:ilvl w:val="0"/>
                 <w:numId w:val="4"/>
@@ -8150,7 +8022,7 @@
     <w:p>
       <w:pPr>
         <w:rPr>
-          <w:rFonts w:ascii="宋体" w:eastAsia="宋体" w:hAnsi="宋体" w:cs="Tahoma" w:hint="eastAsia"/>
+          <w:rFonts w:ascii="SimSun" w:eastAsia="SimSun" w:hAnsi="SimSun" w:cs="Tahoma"/>
           <w:sz w:val="36"/>
           <w:szCs w:val="36"/>
         </w:rPr>
@@ -9065,7 +8937,7 @@
     <w:lsdException w:name="Unresolved Mention" w:semiHidden="1" w:unhideWhenUsed="1"/>
     <w:lsdException w:name="Smart Link" w:semiHidden="1" w:unhideWhenUsed="1"/>
   </w:latentStyles>
-  <w:style w:type="paragraph" w:default="1" w:styleId="a">
+  <w:style w:type="paragraph" w:default="1" w:styleId="Normal">
     <w:name w:val="Normal"/>
     <w:qFormat/>
     <w:rsid w:val="00C070D6"/>
@@ -9083,11 +8955,11 @@
       <w:szCs w:val="24"/>
     </w:rPr>
   </w:style>
-  <w:style w:type="paragraph" w:styleId="1">
+  <w:style w:type="paragraph" w:styleId="Heading1">
     <w:name w:val="heading 1"/>
-    <w:basedOn w:val="a"/>
-    <w:next w:val="a"/>
-    <w:link w:val="10"/>
+    <w:basedOn w:val="Normal"/>
+    <w:next w:val="Normal"/>
+    <w:link w:val="Heading1Char"/>
     <w:uiPriority w:val="99"/>
     <w:qFormat/>
     <w:pPr>
@@ -9100,11 +8972,11 @@
       <w:szCs w:val="32"/>
     </w:rPr>
   </w:style>
-  <w:style w:type="paragraph" w:styleId="2">
+  <w:style w:type="paragraph" w:styleId="Heading2">
     <w:name w:val="heading 2"/>
-    <w:basedOn w:val="a"/>
-    <w:next w:val="a"/>
-    <w:link w:val="20"/>
+    <w:basedOn w:val="Normal"/>
+    <w:next w:val="Normal"/>
+    <w:link w:val="Heading2Char"/>
     <w:uiPriority w:val="99"/>
     <w:qFormat/>
     <w:pPr>
@@ -9119,11 +8991,11 @@
       <w:szCs w:val="28"/>
     </w:rPr>
   </w:style>
-  <w:style w:type="paragraph" w:styleId="3">
+  <w:style w:type="paragraph" w:styleId="Heading3">
     <w:name w:val="heading 3"/>
-    <w:basedOn w:val="a"/>
-    <w:next w:val="a"/>
-    <w:link w:val="30"/>
+    <w:basedOn w:val="Normal"/>
+    <w:next w:val="Normal"/>
+    <w:link w:val="Heading3Char"/>
     <w:uiPriority w:val="99"/>
     <w:qFormat/>
     <w:pPr>
@@ -9136,13 +9008,13 @@
       <w:szCs w:val="26"/>
     </w:rPr>
   </w:style>
-  <w:style w:type="character" w:default="1" w:styleId="a0">
+  <w:style w:type="character" w:default="1" w:styleId="DefaultParagraphFont">
     <w:name w:val="Default Paragraph Font"/>
     <w:uiPriority w:val="1"/>
     <w:semiHidden/>
     <w:unhideWhenUsed/>
   </w:style>
-  <w:style w:type="table" w:default="1" w:styleId="a1">
+  <w:style w:type="table" w:default="1" w:styleId="TableNormal">
     <w:name w:val="Normal Table"/>
     <w:uiPriority w:val="99"/>
     <w:semiHidden/>
@@ -9160,16 +9032,16 @@
       <w:hidden/>
     </w:trPr>
   </w:style>
-  <w:style w:type="numbering" w:default="1" w:styleId="a2">
+  <w:style w:type="numbering" w:default="1" w:styleId="NoList">
     <w:name w:val="No List"/>
     <w:uiPriority w:val="99"/>
     <w:semiHidden/>
     <w:unhideWhenUsed/>
   </w:style>
-  <w:style w:type="character" w:customStyle="1" w:styleId="10">
-    <w:name w:val="标题 1 字符"/>
-    <w:basedOn w:val="a0"/>
-    <w:link w:val="1"/>
+  <w:style w:type="character" w:customStyle="1" w:styleId="Heading1Char">
+    <w:name w:val="Heading 1 Char"/>
+    <w:basedOn w:val="DefaultParagraphFont"/>
+    <w:link w:val="Heading1"/>
     <w:uiPriority w:val="9"/>
     <w:rPr>
       <w:rFonts w:ascii="Arial" w:hAnsi="Arial" w:cs="Arial"/>
@@ -9181,10 +9053,10 @@
       <w:szCs w:val="44"/>
     </w:rPr>
   </w:style>
-  <w:style w:type="character" w:customStyle="1" w:styleId="20">
-    <w:name w:val="标题 2 字符"/>
-    <w:basedOn w:val="a0"/>
-    <w:link w:val="2"/>
+  <w:style w:type="character" w:customStyle="1" w:styleId="Heading2Char">
+    <w:name w:val="Heading 2 Char"/>
+    <w:basedOn w:val="DefaultParagraphFont"/>
+    <w:link w:val="Heading2"/>
     <w:uiPriority w:val="9"/>
     <w:semiHidden/>
     <w:rPr>
@@ -9197,10 +9069,10 @@
       <w:szCs w:val="32"/>
     </w:rPr>
   </w:style>
-  <w:style w:type="character" w:customStyle="1" w:styleId="30">
-    <w:name w:val="标题 3 字符"/>
-    <w:basedOn w:val="a0"/>
-    <w:link w:val="3"/>
+  <w:style w:type="character" w:customStyle="1" w:styleId="Heading3Char">
+    <w:name w:val="Heading 3 Char"/>
+    <w:basedOn w:val="DefaultParagraphFont"/>
+    <w:link w:val="Heading3"/>
     <w:uiPriority w:val="9"/>
     <w:semiHidden/>
     <w:rPr>
@@ -9213,10 +9085,10 @@
       <w:szCs w:val="32"/>
     </w:rPr>
   </w:style>
-  <w:style w:type="paragraph" w:styleId="a3">
+  <w:style w:type="paragraph" w:styleId="Header">
     <w:name w:val="header"/>
-    <w:basedOn w:val="a"/>
-    <w:link w:val="a4"/>
+    <w:basedOn w:val="Normal"/>
+    <w:link w:val="HeaderChar"/>
     <w:uiPriority w:val="99"/>
     <w:unhideWhenUsed/>
     <w:rsid w:val="00750BD4"/>
@@ -9236,10 +9108,10 @@
       <w:szCs w:val="18"/>
     </w:rPr>
   </w:style>
-  <w:style w:type="character" w:customStyle="1" w:styleId="a4">
-    <w:name w:val="页眉 字符"/>
-    <w:basedOn w:val="a0"/>
-    <w:link w:val="a3"/>
+  <w:style w:type="character" w:customStyle="1" w:styleId="HeaderChar">
+    <w:name w:val="Header Char"/>
+    <w:basedOn w:val="DefaultParagraphFont"/>
+    <w:link w:val="Header"/>
     <w:uiPriority w:val="99"/>
     <w:rsid w:val="00750BD4"/>
     <w:rPr>
@@ -9250,10 +9122,10 @@
       <w:szCs w:val="18"/>
     </w:rPr>
   </w:style>
-  <w:style w:type="paragraph" w:styleId="a5">
+  <w:style w:type="paragraph" w:styleId="Footer">
     <w:name w:val="footer"/>
-    <w:basedOn w:val="a"/>
-    <w:link w:val="a6"/>
+    <w:basedOn w:val="Normal"/>
+    <w:link w:val="FooterChar"/>
     <w:uiPriority w:val="99"/>
     <w:unhideWhenUsed/>
     <w:rsid w:val="00750BD4"/>
@@ -9269,10 +9141,10 @@
       <w:szCs w:val="18"/>
     </w:rPr>
   </w:style>
-  <w:style w:type="character" w:customStyle="1" w:styleId="a6">
-    <w:name w:val="页脚 字符"/>
-    <w:basedOn w:val="a0"/>
-    <w:link w:val="a5"/>
+  <w:style w:type="character" w:customStyle="1" w:styleId="FooterChar">
+    <w:name w:val="Footer Char"/>
+    <w:basedOn w:val="DefaultParagraphFont"/>
+    <w:link w:val="Footer"/>
     <w:uiPriority w:val="99"/>
     <w:rsid w:val="00750BD4"/>
     <w:rPr>
@@ -9283,9 +9155,9 @@
       <w:szCs w:val="18"/>
     </w:rPr>
   </w:style>
-  <w:style w:type="character" w:styleId="a7">
+  <w:style w:type="character" w:styleId="Hyperlink">
     <w:name w:val="Hyperlink"/>
-    <w:basedOn w:val="a0"/>
+    <w:basedOn w:val="DefaultParagraphFont"/>
     <w:uiPriority w:val="99"/>
     <w:unhideWhenUsed/>
     <w:rsid w:val="00750BD4"/>
@@ -9295,9 +9167,9 @@
       <w:u w:val="single"/>
     </w:rPr>
   </w:style>
-  <w:style w:type="character" w:styleId="a8">
+  <w:style w:type="character" w:styleId="UnresolvedMention">
     <w:name w:val="Unresolved Mention"/>
-    <w:basedOn w:val="a0"/>
+    <w:basedOn w:val="DefaultParagraphFont"/>
     <w:uiPriority w:val="99"/>
     <w:semiHidden/>
     <w:unhideWhenUsed/>
@@ -9308,9 +9180,9 @@
       <w:shd w:val="clear" w:color="auto" w:fill="E1DFDD"/>
     </w:rPr>
   </w:style>
-  <w:style w:type="table" w:styleId="a9">
+  <w:style w:type="table" w:styleId="TableGrid">
     <w:name w:val="Table Grid"/>
-    <w:basedOn w:val="a1"/>
+    <w:basedOn w:val="TableNormal"/>
     <w:uiPriority w:val="39"/>
     <w:rsid w:val="005C594E"/>
     <w:tblPr>
@@ -9327,9 +9199,9 @@
       <w:hidden/>
     </w:trPr>
   </w:style>
-  <w:style w:type="paragraph" w:styleId="aa">
+  <w:style w:type="paragraph" w:styleId="ListParagraph">
     <w:name w:val="List Paragraph"/>
-    <w:basedOn w:val="a"/>
+    <w:basedOn w:val="Normal"/>
     <w:uiPriority w:val="34"/>
     <w:qFormat/>
     <w:rsid w:val="002B1A46"/>
@@ -9337,9 +9209,9 @@
       <w:ind w:firstLineChars="200" w:firstLine="420"/>
     </w:pPr>
   </w:style>
-  <w:style w:type="character" w:styleId="ab">
+  <w:style w:type="character" w:styleId="FollowedHyperlink">
     <w:name w:val="FollowedHyperlink"/>
-    <w:basedOn w:val="a0"/>
+    <w:basedOn w:val="DefaultParagraphFont"/>
     <w:uiPriority w:val="99"/>
     <w:semiHidden/>
     <w:unhideWhenUsed/>

</xml_diff>